<commit_message>
Week 8 notebooks complete
Still need to set assignments
Perhaps try to do a multi-channel trigger example?
Experiment with parameters?
</commit_message>
<xml_diff>
--- a/week8/samba_mounts_data.docx
+++ b/week8/samba_mounts_data.docx
@@ -117,7 +117,19 @@
           <w:rPr>
             <w:rStyle w:val="Hyperlink"/>
           </w:rPr>
-          <w:t>https://vpn.usf.edu</w:t>
+          <w:t>https://vpn.</w:t>
+        </w:r>
+        <w:r>
+          <w:rPr>
+            <w:rStyle w:val="Hyperlink"/>
+          </w:rPr>
+          <w:t>u</w:t>
+        </w:r>
+        <w:r>
+          <w:rPr>
+            <w:rStyle w:val="Hyperlink"/>
+          </w:rPr>
+          <w:t>sf.edu</w:t>
         </w:r>
       </w:hyperlink>
       <w:r>
@@ -177,7 +189,7 @@
           <w:rStyle w:val="s1"/>
           <w:noProof/>
         </w:rPr>
-        <w:pict w14:anchorId="21952E36">
+        <w:pict w14:anchorId="6DA35286">
           <v:rect id="_x0000_i1042" alt="" style="width:468pt;height:.05pt;mso-width-percent:0;mso-height-percent:0;mso-width-percent:0;mso-height-percent:0" o:hralign="center" o:hrstd="t" o:hr="t" fillcolor="#a0a0a0" stroked="f"/>
         </w:pict>
       </w:r>
@@ -299,7 +311,7 @@
           <w:rStyle w:val="s1"/>
           <w:noProof/>
         </w:rPr>
-        <w:pict w14:anchorId="106AA874">
+        <w:pict w14:anchorId="2450D56E">
           <v:rect id="_x0000_i1041" alt="" style="width:468pt;height:.05pt;mso-width-percent:0;mso-height-percent:0;mso-width-percent:0;mso-height-percent:0" o:hralign="center" o:hrstd="t" o:hr="t" fillcolor="#a0a0a0" stroked="f"/>
         </w:pict>
       </w:r>
@@ -459,7 +471,7 @@
           <w:rStyle w:val="s1"/>
           <w:noProof/>
         </w:rPr>
-        <w:pict w14:anchorId="74275682">
+        <w:pict w14:anchorId="4EF06511">
           <v:rect id="_x0000_i1040" alt="" style="width:468pt;height:.05pt;mso-width-percent:0;mso-height-percent:0;mso-width-percent:0;mso-height-percent:0" o:hralign="center" o:hrstd="t" o:hr="t" fillcolor="#a0a0a0" stroked="f"/>
         </w:pict>
       </w:r>
@@ -596,7 +608,7 @@
           <w:rStyle w:val="s2"/>
           <w:noProof/>
         </w:rPr>
-        <w:pict w14:anchorId="25486870">
+        <w:pict w14:anchorId="59CE4EFF">
           <v:rect id="_x0000_i1039" alt="" style="width:468pt;height:.05pt;mso-width-percent:0;mso-height-percent:0;mso-width-percent:0;mso-height-percent:0" o:hralign="center" o:hrstd="t" o:hr="t" fillcolor="#a0a0a0" stroked="f"/>
         </w:pict>
       </w:r>
@@ -684,7 +696,7 @@
           <w:rStyle w:val="s2"/>
           <w:noProof/>
         </w:rPr>
-        <w:pict w14:anchorId="06E108A8">
+        <w:pict w14:anchorId="0A5EF9E3">
           <v:rect id="_x0000_i1038" alt="" style="width:468pt;height:.05pt;mso-width-percent:0;mso-height-percent:0;mso-width-percent:0;mso-height-percent:0" o:hralign="center" o:hrstd="t" o:hr="t" fillcolor="#a0a0a0" stroked="f"/>
         </w:pict>
       </w:r>
@@ -893,7 +905,7 @@
           <w:rStyle w:val="s1"/>
           <w:noProof/>
         </w:rPr>
-        <w:pict w14:anchorId="746C6116">
+        <w:pict w14:anchorId="43F9EA8A">
           <v:rect id="_x0000_i1037" alt="" style="width:468pt;height:.05pt;mso-width-percent:0;mso-height-percent:0;mso-width-percent:0;mso-height-percent:0" o:hralign="center" o:hrstd="t" o:hr="t" fillcolor="#a0a0a0" stroked="f"/>
         </w:pict>
       </w:r>
@@ -993,7 +1005,7 @@
           <w:rStyle w:val="s2"/>
           <w:noProof/>
         </w:rPr>
-        <w:pict w14:anchorId="02F2F278">
+        <w:pict w14:anchorId="28DDA669">
           <v:rect id="_x0000_i1036" alt="" style="width:468pt;height:.05pt;mso-width-percent:0;mso-height-percent:0;mso-width-percent:0;mso-height-percent:0" o:hralign="center" o:hrstd="t" o:hr="t" fillcolor="#a0a0a0" stroked="f"/>
         </w:pict>
       </w:r>
@@ -1051,7 +1063,7 @@
           <w:noProof/>
         </w:rPr>
         <w:lastRenderedPageBreak/>
-        <w:pict w14:anchorId="184E14F2">
+        <w:pict w14:anchorId="1F4AF3B2">
           <v:rect id="_x0000_i1035" alt="" style="width:468pt;height:.05pt;mso-width-percent:0;mso-height-percent:0;mso-width-percent:0;mso-height-percent:0" o:hralign="center" o:hrstd="t" o:hr="t" fillcolor="#a0a0a0" stroked="f"/>
         </w:pict>
       </w:r>
@@ -1198,7 +1210,7 @@
           <w:rStyle w:val="s1"/>
           <w:noProof/>
         </w:rPr>
-        <w:pict w14:anchorId="28CC16A4">
+        <w:pict w14:anchorId="514FA8F4">
           <v:rect id="_x0000_i1034" alt="" style="width:468pt;height:.05pt;mso-width-percent:0;mso-height-percent:0;mso-width-percent:0;mso-height-percent:0" o:hralign="center" o:hrstd="t" o:hr="t" fillcolor="#a0a0a0" stroked="f"/>
         </w:pict>
       </w:r>
@@ -1328,7 +1340,7 @@
           <w:sz w:val="22"/>
           <w:szCs w:val="22"/>
         </w:rPr>
-        <w:pict w14:anchorId="3756E243">
+        <w:pict w14:anchorId="67B1B5F3">
           <v:rect id="_x0000_i1033" alt="" style="width:468pt;height:.05pt;mso-width-percent:0;mso-height-percent:0;mso-width-percent:0;mso-height-percent:0" o:hralign="center" o:hrstd="t" o:hr="t" fillcolor="#a0a0a0" stroked="f"/>
         </w:pict>
       </w:r>
@@ -1420,7 +1432,7 @@
           <w:sz w:val="22"/>
           <w:szCs w:val="22"/>
         </w:rPr>
-        <w:pict w14:anchorId="05C61CEF">
+        <w:pict w14:anchorId="2E9C63D5">
           <v:rect id="_x0000_i1032" alt="" style="width:468pt;height:.05pt;mso-width-percent:0;mso-height-percent:0;mso-width-percent:0;mso-height-percent:0" o:hralign="center" o:hrstd="t" o:hr="t" fillcolor="#a0a0a0" stroked="f"/>
         </w:pict>
       </w:r>
@@ -1507,7 +1519,7 @@
           <w:sz w:val="22"/>
           <w:szCs w:val="22"/>
         </w:rPr>
-        <w:pict w14:anchorId="5254D6E8">
+        <w:pict w14:anchorId="3CCA4EB6">
           <v:rect id="_x0000_i1031" alt="" style="width:468pt;height:.05pt;mso-width-percent:0;mso-height-percent:0;mso-width-percent:0;mso-height-percent:0" o:hralign="center" o:hrstd="t" o:hr="t" fillcolor="#a0a0a0" stroked="f"/>
         </w:pict>
       </w:r>
@@ -1594,7 +1606,7 @@
           <w:sz w:val="22"/>
           <w:szCs w:val="22"/>
         </w:rPr>
-        <w:pict w14:anchorId="2875CD00">
+        <w:pict w14:anchorId="58F2346A">
           <v:rect id="_x0000_i1030" alt="" style="width:468pt;height:.05pt;mso-width-percent:0;mso-height-percent:0;mso-width-percent:0;mso-height-percent:0" o:hralign="center" o:hrstd="t" o:hr="t" fillcolor="#a0a0a0" stroked="f"/>
         </w:pict>
       </w:r>
@@ -1697,7 +1709,25 @@
           <w:sz w:val="22"/>
           <w:szCs w:val="22"/>
         </w:rPr>
-        <w:t>\\hal9000\classdata</w:t>
+        <w:t>\\</w:t>
+      </w:r>
+      <w:r>
+        <w:rPr>
+          <w:rStyle w:val="HTMLCode"/>
+          <w:rFonts w:eastAsiaTheme="majorEastAsia"/>
+          <w:sz w:val="22"/>
+          <w:szCs w:val="22"/>
+        </w:rPr>
+        <w:t>10.246.31.49</w:t>
+      </w:r>
+      <w:r>
+        <w:rPr>
+          <w:rStyle w:val="HTMLCode"/>
+          <w:rFonts w:eastAsiaTheme="majorEastAsia"/>
+          <w:sz w:val="22"/>
+          <w:szCs w:val="22"/>
+        </w:rPr>
+        <w:t>\classdata</w:t>
       </w:r>
     </w:p>
     <w:p>
@@ -1743,7 +1773,7 @@
           <w:szCs w:val="22"/>
         </w:rPr>
         <w:lastRenderedPageBreak/>
-        <w:pict w14:anchorId="74AED254">
+        <w:pict w14:anchorId="2F663F0F">
           <v:rect id="_x0000_i1029" alt="" style="width:468pt;height:.05pt;mso-width-percent:0;mso-height-percent:0;mso-width-percent:0;mso-height-percent:0" o:hralign="center" o:hrstd="t" o:hr="t" fillcolor="#a0a0a0" stroked="f"/>
         </w:pict>
       </w:r>
@@ -1894,7 +1924,7 @@
           <w:sz w:val="22"/>
           <w:szCs w:val="22"/>
         </w:rPr>
-        <w:pict w14:anchorId="25A5E3B5">
+        <w:pict w14:anchorId="64E90036">
           <v:rect id="_x0000_i1028" alt="" style="width:468pt;height:.05pt;mso-width-percent:0;mso-height-percent:0;mso-width-percent:0;mso-height-percent:0" o:hralign="center" o:hrstd="t" o:hr="t" fillcolor="#a0a0a0" stroked="f"/>
         </w:pict>
       </w:r>
@@ -1954,7 +1984,25 @@
           <w:sz w:val="22"/>
           <w:szCs w:val="22"/>
         </w:rPr>
-        <w:t>Z: classdata (\\hal9000)</w:t>
+        <w:t>Z: classdata (\\</w:t>
+      </w:r>
+      <w:r>
+        <w:rPr>
+          <w:rStyle w:val="HTMLCode"/>
+          <w:rFonts w:eastAsiaTheme="majorEastAsia"/>
+          <w:sz w:val="22"/>
+          <w:szCs w:val="22"/>
+        </w:rPr>
+        <w:t>10.246.31.49</w:t>
+      </w:r>
+      <w:r>
+        <w:rPr>
+          <w:rStyle w:val="HTMLCode"/>
+          <w:rFonts w:eastAsiaTheme="majorEastAsia"/>
+          <w:sz w:val="22"/>
+          <w:szCs w:val="22"/>
+        </w:rPr>
+        <w:t>)</w:t>
       </w:r>
     </w:p>
     <w:p>
@@ -1972,7 +2020,7 @@
           <w:sz w:val="22"/>
           <w:szCs w:val="22"/>
         </w:rPr>
-        <w:pict w14:anchorId="665A4183">
+        <w:pict w14:anchorId="219FC439">
           <v:rect id="_x0000_i1027" alt="" style="width:468pt;height:.05pt;mso-width-percent:0;mso-height-percent:0;mso-width-percent:0;mso-height-percent:0" o:hralign="center" o:hrstd="t" o:hr="t" fillcolor="#a0a0a0" stroked="f"/>
         </w:pict>
       </w:r>
@@ -2150,7 +2198,7 @@
           <w:sz w:val="22"/>
           <w:szCs w:val="22"/>
         </w:rPr>
-        <w:pict w14:anchorId="4EF081E5">
+        <w:pict w14:anchorId="50B1D234">
           <v:rect id="_x0000_i1026" alt="" style="width:468pt;height:.05pt;mso-width-percent:0;mso-height-percent:0;mso-width-percent:0;mso-height-percent:0" o:hralign="center" o:hrstd="t" o:hr="t" fillcolor="#a0a0a0" stroked="f"/>
         </w:pict>
       </w:r>
@@ -2403,7 +2451,27 @@
           <w:sz w:val="22"/>
           <w:szCs w:val="22"/>
         </w:rPr>
-        <w:t>#st = read('Z/Pinatubo/WAVEFORMS/199112/9112010B.DMX')</w:t>
+        <w:t>#st = read('Z</w:t>
+      </w:r>
+      <w:r>
+        <w:rPr>
+          <w:rFonts w:ascii="Courier New" w:hAnsi="Courier New" w:cs="Courier New"/>
+          <w:color w:val="000000"/>
+          <w:kern w:val="0"/>
+          <w:sz w:val="22"/>
+          <w:szCs w:val="22"/>
+        </w:rPr>
+        <w:t>:</w:t>
+      </w:r>
+      <w:r>
+        <w:rPr>
+          <w:rFonts w:ascii="Courier New" w:hAnsi="Courier New" w:cs="Courier New"/>
+          <w:color w:val="000000"/>
+          <w:kern w:val="0"/>
+          <w:sz w:val="22"/>
+          <w:szCs w:val="22"/>
+        </w:rPr>
+        <w:t>/Pinatubo/WAVEFORMS/199112/9112010B.DMX')</w:t>
       </w:r>
     </w:p>
     <w:p>
@@ -2476,7 +2544,7 @@
           <w:rStyle w:val="s1"/>
           <w:noProof/>
         </w:rPr>
-        <w:pict w14:anchorId="27E7D864">
+        <w:pict w14:anchorId="3D3496AA">
           <v:rect id="_x0000_i1025" alt="" style="width:468pt;height:.05pt;mso-width-percent:0;mso-height-percent:0;mso-width-percent:0;mso-height-percent:0" o:hralign="center" o:hrstd="t" o:hr="t" fillcolor="#a0a0a0" stroked="f"/>
         </w:pict>
       </w:r>
@@ -4714,6 +4782,18 @@
       <w:szCs w:val="20"/>
     </w:rPr>
   </w:style>
+  <w:style w:type="character" w:styleId="FollowedHyperlink">
+    <w:name w:val="FollowedHyperlink"/>
+    <w:basedOn w:val="DefaultParagraphFont"/>
+    <w:uiPriority w:val="99"/>
+    <w:semiHidden/>
+    <w:unhideWhenUsed/>
+    <w:rsid w:val="00A25C12"/>
+    <w:rPr>
+      <w:color w:val="96607D" w:themeColor="followedHyperlink"/>
+      <w:u w:val="single"/>
+    </w:rPr>
+  </w:style>
 </w:styles>
 </file>
 

</xml_diff>